<commit_message>
Update Task Info 41.1
</commit_message>
<xml_diff>
--- a/Documentation/Analysis/Task Informations/Open/Team/Task Info WBS-41.1.docx
+++ b/Documentation/Analysis/Task Informations/Open/Team/Task Info WBS-41.1.docx
@@ -224,7 +224,13 @@
               <w:rPr>
                 <w:rFonts w:ascii="Zain" w:eastAsia="Arial Unicode MS" w:hAnsi="Zain" w:cs="Zain" w:hint="cs"/>
               </w:rPr>
-              <w:t>1405/3/2</w:t>
+              <w:t>1405/3/</w:t>
+            </w:r>
+            <w:r>
+              <w:rPr>
+                <w:rFonts w:ascii="Zain" w:eastAsia="Arial Unicode MS" w:hAnsi="Zain" w:cs="Zain"/>
+              </w:rPr>
+              <w:t>23</w:t>
             </w:r>
           </w:p>
         </w:tc>
@@ -363,9 +369,9 @@
             </w:pPr>
             <w:r>
               <w:rPr>
-                <w:rFonts w:ascii="Zain" w:eastAsia="Arial Unicode MS" w:hAnsi="Zain" w:cs="Zain" w:hint="cs"/>
-              </w:rPr>
-              <w:t>Team</w:t>
+                <w:rFonts w:ascii="Zain" w:eastAsia="Arial Unicode MS" w:hAnsi="Zain" w:cs="Zain"/>
+              </w:rPr>
+              <w:t>Anolfazl</w:t>
             </w:r>
           </w:p>
         </w:tc>
@@ -1072,7 +1078,6 @@
           <w:rFonts w:ascii="Zain" w:eastAsia="Chalkboard SE Regular" w:hAnsi="Zain" w:cs="Zain"/>
         </w:rPr>
       </w:pPr>
-      <w:proofErr w:type="spellStart"/>
       <w:r>
         <w:rPr>
           <w:rFonts w:ascii="Zain" w:eastAsia="Arial Unicode MS" w:hAnsi="Zain" w:cs="Zain" w:hint="cs"/>
@@ -1080,217 +1085,6 @@
         </w:rPr>
         <w:lastRenderedPageBreak/>
         <w:t>توضیحات</w:t>
-      </w:r>
-      <w:proofErr w:type="spellEnd"/>
-    </w:p>
-    <w:p>
-      <w:pPr>
-        <w:pStyle w:val="Body"/>
-        <w:bidi/>
-        <w:rPr>
-          <w:rFonts w:ascii="Zain" w:hAnsi="Zain" w:cs="Zain"/>
-        </w:rPr>
-      </w:pPr>
-      <w:proofErr w:type="spellStart"/>
-      <w:r>
-        <w:rPr>
-          <w:rFonts w:ascii="Zain" w:hAnsi="Zain" w:cs="Zain" w:hint="cs"/>
-          <w:rtl/>
-        </w:rPr>
-        <w:t>برای</w:t>
-      </w:r>
-      <w:proofErr w:type="spellEnd"/>
-      <w:r>
-        <w:rPr>
-          <w:rFonts w:ascii="Zain" w:hAnsi="Zain" w:cs="Zain" w:hint="cs"/>
-          <w:rtl/>
-        </w:rPr>
-        <w:t xml:space="preserve"> هر </w:t>
-      </w:r>
-      <w:proofErr w:type="spellStart"/>
-      <w:r>
-        <w:rPr>
-          <w:rFonts w:ascii="Zain" w:hAnsi="Zain" w:cs="Zain" w:hint="cs"/>
-          <w:rtl/>
-        </w:rPr>
-        <w:t>تسک</w:t>
-      </w:r>
-      <w:proofErr w:type="spellEnd"/>
-      <w:r>
-        <w:rPr>
-          <w:rFonts w:ascii="Zain" w:hAnsi="Zain" w:cs="Zain" w:hint="cs"/>
-          <w:rtl/>
-        </w:rPr>
-        <w:t xml:space="preserve"> در </w:t>
-      </w:r>
-      <w:r>
-        <w:rPr>
-          <w:rFonts w:ascii="Zain" w:hAnsi="Zain" w:cs="Zain" w:hint="cs"/>
-          <w:lang w:val="de-DE"/>
-        </w:rPr>
-        <w:t>WBS</w:t>
-      </w:r>
-      <w:r>
-        <w:rPr>
-          <w:rFonts w:ascii="Zain" w:hAnsi="Zain" w:cs="Zain" w:hint="cs"/>
-          <w:rtl/>
-        </w:rPr>
-        <w:t xml:space="preserve"> </w:t>
-      </w:r>
-      <w:proofErr w:type="spellStart"/>
-      <w:r>
-        <w:rPr>
-          <w:rFonts w:ascii="Zain" w:hAnsi="Zain" w:cs="Zain" w:hint="cs"/>
-          <w:rtl/>
-        </w:rPr>
-        <w:t>براساس</w:t>
-      </w:r>
-      <w:proofErr w:type="spellEnd"/>
-      <w:r>
-        <w:rPr>
-          <w:rFonts w:ascii="Zain" w:hAnsi="Zain" w:cs="Zain" w:hint="cs"/>
-          <w:rtl/>
-        </w:rPr>
-        <w:t xml:space="preserve"> شماره آن، </w:t>
-      </w:r>
-      <w:proofErr w:type="spellStart"/>
-      <w:r>
-        <w:rPr>
-          <w:rFonts w:ascii="Zain" w:hAnsi="Zain" w:cs="Zain" w:hint="cs"/>
-          <w:rtl/>
-        </w:rPr>
-        <w:t>یک</w:t>
-      </w:r>
-      <w:proofErr w:type="spellEnd"/>
-      <w:r>
-        <w:rPr>
-          <w:rFonts w:ascii="Zain" w:hAnsi="Zain" w:cs="Zain" w:hint="cs"/>
-          <w:rtl/>
-        </w:rPr>
-        <w:t xml:space="preserve"> </w:t>
-      </w:r>
-      <w:r>
-        <w:rPr>
-          <w:rFonts w:ascii="Zain" w:hAnsi="Zain" w:cs="Zain" w:hint="cs"/>
-          <w:lang w:val="de-DE"/>
-        </w:rPr>
-        <w:t>Task</w:t>
-      </w:r>
-      <w:r>
-        <w:rPr>
-          <w:rFonts w:ascii="Zain" w:hAnsi="Zain" w:cs="Zain" w:hint="cs"/>
-          <w:rtl/>
-        </w:rPr>
-        <w:t xml:space="preserve"> </w:t>
-      </w:r>
-      <w:r>
-        <w:rPr>
-          <w:rFonts w:ascii="Zain" w:hAnsi="Zain" w:cs="Zain" w:hint="cs"/>
-        </w:rPr>
-        <w:t>Information</w:t>
-      </w:r>
-      <w:r>
-        <w:rPr>
-          <w:rFonts w:ascii="Zain" w:hAnsi="Zain" w:cs="Zain" w:hint="cs"/>
-          <w:rtl/>
-        </w:rPr>
-        <w:t xml:space="preserve"> </w:t>
-      </w:r>
-      <w:proofErr w:type="spellStart"/>
-      <w:r>
-        <w:rPr>
-          <w:rFonts w:ascii="Zain" w:hAnsi="Zain" w:cs="Zain" w:hint="cs"/>
-          <w:rtl/>
-        </w:rPr>
-        <w:t>میسازیم</w:t>
-      </w:r>
-      <w:proofErr w:type="spellEnd"/>
-      <w:r>
-        <w:rPr>
-          <w:rFonts w:ascii="Zain" w:hAnsi="Zain" w:cs="Zain" w:hint="cs"/>
-          <w:rtl/>
-        </w:rPr>
-        <w:t xml:space="preserve"> تا هم در </w:t>
-      </w:r>
-      <w:proofErr w:type="spellStart"/>
-      <w:r>
-        <w:rPr>
-          <w:rFonts w:ascii="Zain" w:hAnsi="Zain" w:cs="Zain" w:hint="cs"/>
-          <w:rtl/>
-        </w:rPr>
-        <w:t>داکیومنت</w:t>
-      </w:r>
-      <w:proofErr w:type="spellEnd"/>
-      <w:r>
-        <w:rPr>
-          <w:rFonts w:ascii="Zain" w:hAnsi="Zain" w:cs="Zain" w:hint="cs"/>
-          <w:rtl/>
-        </w:rPr>
-        <w:t xml:space="preserve"> ها قرار </w:t>
-      </w:r>
-      <w:proofErr w:type="spellStart"/>
-      <w:r>
-        <w:rPr>
-          <w:rFonts w:ascii="Zain" w:hAnsi="Zain" w:cs="Zain" w:hint="cs"/>
-          <w:rtl/>
-        </w:rPr>
-        <w:t>بدیم</w:t>
-      </w:r>
-      <w:proofErr w:type="spellEnd"/>
-      <w:r>
-        <w:rPr>
-          <w:rFonts w:ascii="Zain" w:hAnsi="Zain" w:cs="Zain" w:hint="cs"/>
-          <w:rtl/>
-        </w:rPr>
-        <w:t xml:space="preserve">، هم </w:t>
-      </w:r>
-      <w:proofErr w:type="spellStart"/>
-      <w:r>
-        <w:rPr>
-          <w:rFonts w:ascii="Zain" w:hAnsi="Zain" w:cs="Zain" w:hint="cs"/>
-          <w:rtl/>
-        </w:rPr>
-        <w:t>مدیریت</w:t>
-      </w:r>
-      <w:proofErr w:type="spellEnd"/>
-      <w:r>
-        <w:rPr>
-          <w:rFonts w:ascii="Zain" w:hAnsi="Zain" w:cs="Zain" w:hint="cs"/>
-          <w:rtl/>
-        </w:rPr>
-        <w:t xml:space="preserve"> </w:t>
-      </w:r>
-      <w:proofErr w:type="spellStart"/>
-      <w:r>
-        <w:rPr>
-          <w:rFonts w:ascii="Zain" w:hAnsi="Zain" w:cs="Zain" w:hint="cs"/>
-          <w:rtl/>
-        </w:rPr>
-        <w:t>بهتری</w:t>
-      </w:r>
-      <w:proofErr w:type="spellEnd"/>
-      <w:r>
-        <w:rPr>
-          <w:rFonts w:ascii="Zain" w:hAnsi="Zain" w:cs="Zain" w:hint="cs"/>
-          <w:rtl/>
-        </w:rPr>
-        <w:t xml:space="preserve"> داشته </w:t>
-      </w:r>
-      <w:proofErr w:type="spellStart"/>
-      <w:r>
-        <w:rPr>
-          <w:rFonts w:ascii="Zain" w:hAnsi="Zain" w:cs="Zain" w:hint="cs"/>
-          <w:rtl/>
-        </w:rPr>
-        <w:t>باشیم</w:t>
-      </w:r>
-      <w:proofErr w:type="spellEnd"/>
-      <w:r>
-        <w:rPr>
-          <w:rFonts w:ascii="Zain" w:hAnsi="Zain" w:cs="Zain" w:hint="cs"/>
-          <w:rtl/>
-        </w:rPr>
-        <w:t>.</w:t>
       </w:r>
     </w:p>
     <w:p>
@@ -1306,52 +1100,48 @@
           <w:rFonts w:ascii="Zain" w:hAnsi="Zain" w:cs="Zain" w:hint="cs"/>
           <w:rtl/>
         </w:rPr>
-        <w:t xml:space="preserve">مثال </w:t>
+        <w:t xml:space="preserve">برای هر تسک در </w:t>
       </w:r>
-      <w:proofErr w:type="spellStart"/>
+      <w:r>
+        <w:rPr>
+          <w:rFonts w:ascii="Zain" w:hAnsi="Zain" w:cs="Zain" w:hint="cs"/>
+          <w:lang w:val="de-DE"/>
+        </w:rPr>
+        <w:t>WBS</w:t>
+      </w:r>
       <w:r>
         <w:rPr>
           <w:rFonts w:ascii="Zain" w:hAnsi="Zain" w:cs="Zain" w:hint="cs"/>
           <w:rtl/>
         </w:rPr>
-        <w:t>تکمیل</w:t>
+        <w:t xml:space="preserve"> براساس شماره آن، یک </w:t>
       </w:r>
-      <w:proofErr w:type="spellEnd"/>
+      <w:r>
+        <w:rPr>
+          <w:rFonts w:ascii="Zain" w:hAnsi="Zain" w:cs="Zain" w:hint="cs"/>
+          <w:lang w:val="de-DE"/>
+        </w:rPr>
+        <w:t>Task</w:t>
+      </w:r>
       <w:r>
         <w:rPr>
           <w:rFonts w:ascii="Zain" w:hAnsi="Zain" w:cs="Zain" w:hint="cs"/>
           <w:rtl/>
         </w:rPr>
-        <w:t xml:space="preserve"> شده در صفحه </w:t>
+        <w:t xml:space="preserve"> </w:t>
       </w:r>
       <w:r>
         <w:rPr>
           <w:rFonts w:ascii="Zain" w:hAnsi="Zain" w:cs="Zain" w:hint="cs"/>
         </w:rPr>
-        <w:t xml:space="preserve">23 </w:t>
+        <w:t>Information</w:t>
       </w:r>
       <w:r>
         <w:rPr>
           <w:rFonts w:ascii="Zain" w:hAnsi="Zain" w:cs="Zain" w:hint="cs"/>
           <w:rtl/>
         </w:rPr>
-        <w:t xml:space="preserve">فصل ۲ </w:t>
-      </w:r>
-      <w:proofErr w:type="spellStart"/>
-      <w:r>
-        <w:rPr>
-          <w:rFonts w:ascii="Zain" w:hAnsi="Zain" w:cs="Zain" w:hint="cs"/>
-          <w:rtl/>
-        </w:rPr>
-        <w:t>آمده</w:t>
-      </w:r>
-      <w:proofErr w:type="spellEnd"/>
-      <w:r>
-        <w:rPr>
-          <w:rFonts w:ascii="Zain" w:hAnsi="Zain" w:cs="Zain" w:hint="cs"/>
-          <w:rtl/>
-        </w:rPr>
-        <w:t xml:space="preserve"> است.</w:t>
+        <w:t xml:space="preserve"> میسازیم تا هم در داکیومنت ها قرار بدیم، هم مدیریت بهتری داشته باشیم.</w:t>
       </w:r>
     </w:p>
     <w:p>
@@ -1362,83 +1152,25 @@
           <w:rFonts w:ascii="Zain" w:hAnsi="Zain" w:cs="Zain"/>
         </w:rPr>
       </w:pPr>
-      <w:proofErr w:type="spellStart"/>
       <w:r>
         <w:rPr>
           <w:rFonts w:ascii="Zain" w:hAnsi="Zain" w:cs="Zain" w:hint="cs"/>
           <w:rtl/>
         </w:rPr>
-        <w:t>تخمین</w:t>
+        <w:t xml:space="preserve">مثال تکمیل شده در صفحه </w:t>
       </w:r>
-      <w:proofErr w:type="spellEnd"/>
+      <w:r>
+        <w:rPr>
+          <w:rFonts w:ascii="Zain" w:hAnsi="Zain" w:cs="Zain" w:hint="cs"/>
+        </w:rPr>
+        <w:t xml:space="preserve">23 </w:t>
+      </w:r>
       <w:r>
         <w:rPr>
           <w:rFonts w:ascii="Zain" w:hAnsi="Zain" w:cs="Zain" w:hint="cs"/>
           <w:rtl/>
         </w:rPr>
-        <w:t xml:space="preserve"> زمان ها </w:t>
-      </w:r>
-      <w:proofErr w:type="spellStart"/>
-      <w:r>
-        <w:rPr>
-          <w:rFonts w:ascii="Zain" w:hAnsi="Zain" w:cs="Zain" w:hint="cs"/>
-          <w:rtl/>
-        </w:rPr>
-        <w:t>با</w:t>
-      </w:r>
-      <w:proofErr w:type="spellEnd"/>
-      <w:r>
-        <w:rPr>
-          <w:rFonts w:ascii="Zain" w:hAnsi="Zain" w:cs="Zain" w:hint="cs"/>
-          <w:rtl/>
-        </w:rPr>
-        <w:t xml:space="preserve"> </w:t>
-      </w:r>
-      <w:proofErr w:type="spellStart"/>
-      <w:r>
-        <w:rPr>
-          <w:rFonts w:ascii="Zain" w:hAnsi="Zain" w:cs="Zain" w:hint="cs"/>
-          <w:rtl/>
-        </w:rPr>
-        <w:t>فرمول</w:t>
-      </w:r>
-      <w:proofErr w:type="spellEnd"/>
-      <w:r>
-        <w:rPr>
-          <w:rFonts w:ascii="Zain" w:hAnsi="Zain" w:cs="Zain" w:hint="cs"/>
-          <w:rtl/>
-        </w:rPr>
-        <w:t xml:space="preserve"> </w:t>
-      </w:r>
-      <w:r>
-        <w:rPr>
-          <w:rFonts w:ascii="Zain" w:hAnsi="Zain" w:cs="Zain" w:hint="cs"/>
-          <w:lang w:val="de-DE"/>
-        </w:rPr>
-        <w:t>PERT</w:t>
-      </w:r>
-      <w:r>
-        <w:rPr>
-          <w:rFonts w:ascii="Zain" w:hAnsi="Zain" w:cs="Zain" w:hint="cs"/>
-          <w:rtl/>
-        </w:rPr>
-        <w:t xml:space="preserve"> انجام </w:t>
-      </w:r>
-      <w:proofErr w:type="spellStart"/>
-      <w:r>
-        <w:rPr>
-          <w:rFonts w:ascii="Zain" w:hAnsi="Zain" w:cs="Zain" w:hint="cs"/>
-          <w:rtl/>
-        </w:rPr>
-        <w:t>میشود</w:t>
-      </w:r>
-      <w:proofErr w:type="spellEnd"/>
-      <w:r>
-        <w:rPr>
-          <w:rFonts w:ascii="Zain" w:hAnsi="Zain" w:cs="Zain" w:hint="cs"/>
-          <w:rtl/>
-        </w:rPr>
-        <w:t>.</w:t>
+        <w:t>فصل ۲ آمده است.</w:t>
       </w:r>
     </w:p>
     <w:p>
@@ -1449,85 +1181,42 @@
           <w:rFonts w:ascii="Zain" w:hAnsi="Zain" w:cs="Zain"/>
         </w:rPr>
       </w:pPr>
-      <w:proofErr w:type="spellStart"/>
       <w:r>
         <w:rPr>
           <w:rFonts w:ascii="Zain" w:hAnsi="Zain" w:cs="Zain" w:hint="cs"/>
           <w:rtl/>
         </w:rPr>
-        <w:t>ترتیب</w:t>
+        <w:t xml:space="preserve">تخمین زمان ها با فرمول </w:t>
       </w:r>
-      <w:proofErr w:type="spellEnd"/>
+      <w:r>
+        <w:rPr>
+          <w:rFonts w:ascii="Zain" w:hAnsi="Zain" w:cs="Zain" w:hint="cs"/>
+          <w:lang w:val="de-DE"/>
+        </w:rPr>
+        <w:t>PERT</w:t>
+      </w:r>
       <w:r>
         <w:rPr>
           <w:rFonts w:ascii="Zain" w:hAnsi="Zain" w:cs="Zain" w:hint="cs"/>
           <w:rtl/>
         </w:rPr>
-        <w:t xml:space="preserve"> </w:t>
+        <w:t xml:space="preserve"> انجام میشود.</w:t>
       </w:r>
-      <w:proofErr w:type="spellStart"/>
+    </w:p>
+    <w:p>
+      <w:pPr>
+        <w:pStyle w:val="Body"/>
+        <w:bidi/>
+        <w:rPr>
+          <w:rFonts w:ascii="Zain" w:hAnsi="Zain" w:cs="Zain"/>
+        </w:rPr>
+      </w:pPr>
       <w:r>
         <w:rPr>
           <w:rFonts w:ascii="Zain" w:hAnsi="Zain" w:cs="Zain" w:hint="cs"/>
           <w:rtl/>
         </w:rPr>
-        <w:t>اولویت</w:t>
-      </w:r>
-      <w:proofErr w:type="spellEnd"/>
-      <w:r>
-        <w:rPr>
-          <w:rFonts w:ascii="Zain" w:hAnsi="Zain" w:cs="Zain" w:hint="cs"/>
-          <w:rtl/>
-        </w:rPr>
-        <w:t xml:space="preserve"> </w:t>
-      </w:r>
-      <w:proofErr w:type="spellStart"/>
-      <w:r>
-        <w:rPr>
-          <w:rFonts w:ascii="Zain" w:hAnsi="Zain" w:cs="Zain" w:hint="cs"/>
-          <w:rtl/>
-        </w:rPr>
-        <w:t>بندی</w:t>
-      </w:r>
-      <w:proofErr w:type="spellEnd"/>
-      <w:r>
-        <w:rPr>
-          <w:rFonts w:ascii="Zain" w:hAnsi="Zain" w:cs="Zain" w:hint="cs"/>
-          <w:rtl/>
-        </w:rPr>
-        <w:t xml:space="preserve"> در </w:t>
-      </w:r>
-      <w:proofErr w:type="spellStart"/>
-      <w:r>
-        <w:rPr>
-          <w:rFonts w:ascii="Zain" w:hAnsi="Zain" w:cs="Zain" w:hint="cs"/>
-          <w:rtl/>
-        </w:rPr>
-        <w:t>زیر</w:t>
-      </w:r>
-      <w:proofErr w:type="spellEnd"/>
-      <w:r>
-        <w:rPr>
-          <w:rFonts w:ascii="Zain" w:hAnsi="Zain" w:cs="Zain" w:hint="cs"/>
-          <w:rtl/>
-        </w:rPr>
-        <w:t xml:space="preserve"> </w:t>
-      </w:r>
-      <w:proofErr w:type="spellStart"/>
-      <w:r>
-        <w:rPr>
-          <w:rFonts w:ascii="Zain" w:hAnsi="Zain" w:cs="Zain" w:hint="cs"/>
-          <w:rtl/>
-        </w:rPr>
-        <w:t>آورده</w:t>
-      </w:r>
-      <w:proofErr w:type="spellEnd"/>
-      <w:r>
-        <w:rPr>
-          <w:rFonts w:ascii="Zain" w:hAnsi="Zain" w:cs="Zain" w:hint="cs"/>
-          <w:rtl/>
-        </w:rPr>
-        <w:t xml:space="preserve"> شده است:</w:t>
+        <w:t>ترتیب اولویت بندی در زیر آورده شده است:</w:t>
       </w:r>
     </w:p>
     <w:p>
@@ -1545,55 +1234,7 @@
           <w:rFonts w:ascii="Zain" w:hAnsi="Zain" w:cs="Zain" w:hint="cs"/>
           <w:rtl/>
         </w:rPr>
-        <w:t xml:space="preserve">انواع </w:t>
-      </w:r>
-      <w:proofErr w:type="spellStart"/>
-      <w:r>
-        <w:rPr>
-          <w:rFonts w:ascii="Zain" w:hAnsi="Zain" w:cs="Zain" w:hint="cs"/>
-          <w:rtl/>
-        </w:rPr>
-        <w:t>اولویت</w:t>
-      </w:r>
-      <w:proofErr w:type="spellEnd"/>
-      <w:r>
-        <w:rPr>
-          <w:rFonts w:ascii="Zain" w:hAnsi="Zain" w:cs="Zain" w:hint="cs"/>
-          <w:rtl/>
-        </w:rPr>
-        <w:t xml:space="preserve"> </w:t>
-      </w:r>
-      <w:proofErr w:type="spellStart"/>
-      <w:r>
-        <w:rPr>
-          <w:rFonts w:ascii="Zain" w:hAnsi="Zain" w:cs="Zain" w:hint="cs"/>
-          <w:rtl/>
-        </w:rPr>
-        <w:t>بندی</w:t>
-      </w:r>
-      <w:proofErr w:type="spellEnd"/>
-      <w:r>
-        <w:rPr>
-          <w:rFonts w:ascii="Zain" w:hAnsi="Zain" w:cs="Zain" w:hint="cs"/>
-          <w:rtl/>
-        </w:rPr>
-        <w:t xml:space="preserve">: ۱) </w:t>
-      </w:r>
-      <w:proofErr w:type="spellStart"/>
-      <w:r>
-        <w:rPr>
-          <w:rFonts w:ascii="Zain" w:hAnsi="Zain" w:cs="Zain" w:hint="cs"/>
-          <w:rtl/>
-        </w:rPr>
-        <w:t>زیاد</w:t>
-      </w:r>
-      <w:proofErr w:type="spellEnd"/>
-      <w:r>
-        <w:rPr>
-          <w:rFonts w:ascii="Zain" w:hAnsi="Zain" w:cs="Zain" w:hint="cs"/>
-          <w:rtl/>
-        </w:rPr>
-        <w:t xml:space="preserve"> | </w:t>
+        <w:t xml:space="preserve">انواع اولویت بندی: ۱) زیاد | </w:t>
       </w:r>
       <w:proofErr w:type="gramStart"/>
       <w:r>
@@ -1650,17 +1291,8 @@
           <w:rFonts w:ascii="Zain" w:hAnsi="Zain" w:cs="Zain" w:hint="cs"/>
           <w:rtl/>
         </w:rPr>
-        <w:t xml:space="preserve"> ۳) </w:t>
+        <w:t xml:space="preserve"> ۳) کم</w:t>
       </w:r>
-      <w:proofErr w:type="spellStart"/>
-      <w:r>
-        <w:rPr>
-          <w:rFonts w:ascii="Zain" w:hAnsi="Zain" w:cs="Zain" w:hint="cs"/>
-          <w:rtl/>
-        </w:rPr>
-        <w:t>کم</w:t>
-      </w:r>
-      <w:proofErr w:type="spellEnd"/>
       <w:r>
         <w:rPr>
           <w:rFonts w:ascii="Zain" w:hAnsi="Zain" w:cs="Zain" w:hint="cs"/>
@@ -2473,15 +2105,8 @@
         <w:rFonts w:ascii="Zain" w:hAnsi="Zain" w:cs="Zain" w:hint="cs"/>
       </w:rPr>
       <w:tab/>
-    </w:r>
-    <w:proofErr w:type="spellStart"/>
-    <w:r>
-      <w:rPr>
-        <w:rFonts w:ascii="Zain" w:hAnsi="Zain" w:cs="Zain" w:hint="cs"/>
-      </w:rPr>
       <w:t>CSharpers</w:t>
     </w:r>
-    <w:proofErr w:type="spellEnd"/>
   </w:p>
 </w:hdr>
 </file>

</xml_diff>